<commit_message>
adding switch inventory tool
</commit_message>
<xml_diff>
--- a/XCO_MCP_Tier2_Operator_Notes.docx
+++ b/XCO_MCP_Tier2_Operator_Notes.docx
@@ -4582,6 +4582,98 @@
     <w:p>
       <w:r>
         <w:t>• “Drill into the top issue.”</w:t>
+      </w:r>
+    </w:p>
+    <w:p>
+      <w:pPr/>
+      <w:r>
+        <w:t>• “Include device details for the switches table.”</w:t>
+      </w:r>
+    </w:p>
+    <w:p>
+      <w:pPr/>
+      <w:r>
+        <w:t>• “Show the top 20 switches.”</w:t>
+      </w:r>
+    </w:p>
+    <w:p>
+      <w:pPr/>
+      <w:r>
+        <w:t>• “Which switches are degraded or failing discovery?”</w:t>
+      </w:r>
+    </w:p>
+    <w:p>
+      <w:pPr/>
+      <w:r>
+        <w:t>• “List all switches in fabric DC with IP, model, firmware, and discovery status.”</w:t>
+      </w:r>
+    </w:p>
+    <w:p>
+      <w:pPr/>
+      <w:r>
+        <w:t>• “Show me the switches inventory table.”</w:t>
+      </w:r>
+    </w:p>
+    <w:p>
+      <w:pPr>
+        <w:pStyle w:val="Heading3"/>
+      </w:pPr>
+      <w:r>
+        <w:t>Example Natural Language Prompts</w:t>
+      </w:r>
+    </w:p>
+    <w:p>
+      <w:pPr/>
+      <w:r>
+        <w:t>• Filtering by fabric to focus on a specific environment (e.g., DC).</w:t>
+      </w:r>
+    </w:p>
+    <w:p>
+      <w:pPr/>
+      <w:r>
+        <w:t>• Verifying discovery status and software versions during troubleshooting.</w:t>
+      </w:r>
+    </w:p>
+    <w:p>
+      <w:pPr/>
+      <w:r>
+        <w:t>• Reviewing switch inventory at-a-glance across fabrics.</w:t>
+      </w:r>
+    </w:p>
+    <w:p>
+      <w:pPr/>
+      <w:r>
+        <w:t>• Building or validating the Inventory widget/table in the MCP client UI.</w:t>
+      </w:r>
+    </w:p>
+    <w:p>
+      <w:pPr>
+        <w:pStyle w:val="Heading3"/>
+      </w:pPr>
+      <w:r>
+        <w:t>Operator Scenarios</w:t>
+      </w:r>
+    </w:p>
+    <w:p>
+      <w:pPr/>
+      <w:r>
+        <w:t>Purpose: Tier-2: Provide a dashboard-ready switch inventory table (IP, name, fabric, role, model, firmware, discovery status). Composite of inventory switch listing with optional enrichment (e.g., discovery interval/reason when include_device_details=true).</w:t>
+      </w:r>
+    </w:p>
+    <w:p>
+      <w:pPr>
+        <w:pStyle w:val="Heading3"/>
+      </w:pPr>
+      <w:r>
+        <w:t>Service Area: inventory</w:t>
+      </w:r>
+    </w:p>
+    <w:p>
+      <w:pPr>
+        <w:pStyle w:val="Heading2"/>
+      </w:pPr>
+      <w:r>
+        <w:t>inventory_get_switches_widget_table</w:t>
       </w:r>
     </w:p>
     <w:p>

</xml_diff>

<commit_message>
Document restconf_get_interface_all in YAML spec and operator notes
- Added restconf_get_interface_all to openapi_mcp_invoke.yaml with full
  input schema (switch_ip, include_raw, username, password, verify_tls,
  timeout_seconds)
- Added restconf_get_interface_all entry to XCO_MCP_Tier2_Operator_Notes.docx
  with description and operator use cases

https://claude.ai/code/session_01B3UjbW7mdrCSuhMHU2owUN
</commit_message>
<xml_diff>
--- a/XCO_MCP_Tier2_Operator_Notes.docx
+++ b/XCO_MCP_Tier2_Operator_Notes.docx
@@ -6833,6 +6833,24 @@
     <w:p>
       <w:r>
         <w:t>Use case: AI: 'Check if maintenance rate monitoring is configured.'</w:t>
+      </w:r>
+    </w:p>
+    <w:p>
+      <w:pPr>
+        <w:pStyle w:val="Heading3"/>
+      </w:pPr>
+      <w:r>
+        <w:t>restconf_get_interface_all</w:t>
+      </w:r>
+    </w:p>
+    <w:p>
+      <w:r>
+        <w:t>Get all interfaces (management, ethernet, and port-channel) directly from the switch via RESTCONF GET on the brocade-interface data tree. Returns per-interface details including name, type, shutdown status, description, IP addresses, and channel-group membership, plus a summary with total counts by type and active/shutdown breakdown.</w:t>
+      </w:r>
+    </w:p>
+    <w:p>
+      <w:r>
+        <w:t>Use cases: AI: 'Show all interfaces on switch 10.13.9.62.' / AI: 'How many ports are active vs shutdown on this leaf?' / UI: Display interface inventory with active/shutdown counts across management, ethernet, and port-channel types.</w:t>
       </w:r>
     </w:p>
     <w:sectPr>

</xml_diff>